<commit_message>
Thesis: address memo to Partners Group, from Zion Kidd
Co-Authored-By: Claude Sonnet 5.5 <noreply@anthropic.com>
Claude-Session: https://claude.ai/code/session_01VDqFdsTyzvZmMTXYFu7qh3
</commit_message>
<xml_diff>
--- a/engagements/dynacast/thesis/Dynacast_IC_Memo.docx
+++ b/engagements/dynacast/thesis/Dynacast_IC_Memo.docx
@@ -50,13 +50,13 @@
         </w:tblCellMar>
       </w:tblPr>
       <w:tblGrid>
-        <w:gridCol w:w="2050"/>
-        <w:gridCol w:w="4550"/>
+        <w:gridCol w:w="1400"/>
+        <w:gridCol w:w="5200"/>
       </w:tblGrid>
       <w:tr>
         <w:tc>
           <w:tcPr>
-            <w:tcW w:w="2050" w:type="dxa"/>
+            <w:tcW w:w="1400" w:type="dxa"/>
           </w:tcPr>
           <w:p>
             <w:pPr>
@@ -75,7 +75,7 @@
         </w:tc>
         <w:tc>
           <w:tcPr>
-            <w:tcW w:w="4550" w:type="dxa"/>
+            <w:tcW w:w="5200" w:type="dxa"/>
           </w:tcPr>
           <w:p>
             <w:pPr>
@@ -94,7 +94,7 @@
       <w:tr>
         <w:tc>
           <w:tcPr>
-            <w:tcW w:w="2050" w:type="dxa"/>
+            <w:tcW w:w="1400" w:type="dxa"/>
           </w:tcPr>
           <w:p>
             <w:pPr>
@@ -107,13 +107,13 @@
                 <w:sz w:val="22"/>
                 <w:szCs w:val="22"/>
               </w:rPr>
-              <w:t xml:space="preserve">Re:</w:t>
-            </w:r>
-          </w:p>
-        </w:tc>
-        <w:tc>
-          <w:tcPr>
-            <w:tcW w:w="4550" w:type="dxa"/>
+              <w:t xml:space="preserve">To:</w:t>
+            </w:r>
+          </w:p>
+        </w:tc>
+        <w:tc>
+          <w:tcPr>
+            <w:tcW w:w="5200" w:type="dxa"/>
           </w:tcPr>
           <w:p>
             <w:pPr>
@@ -124,7 +124,7 @@
                 <w:sz w:val="22"/>
                 <w:szCs w:val="22"/>
               </w:rPr>
-              <w:t xml:space="preserve">Dynacast International — LBO Returns Analysis: Base, Bull and Bear Cases</w:t>
+              <w:t xml:space="preserve">Joel Schwartz, Managing Director, Partners Group</w:t>
             </w:r>
           </w:p>
         </w:tc>
@@ -132,7 +132,7 @@
       <w:tr>
         <w:tc>
           <w:tcPr>
-            <w:tcW w:w="2050" w:type="dxa"/>
+            <w:tcW w:w="1400" w:type="dxa"/>
           </w:tcPr>
           <w:p>
             <w:pPr>
@@ -145,13 +145,13 @@
                 <w:sz w:val="22"/>
                 <w:szCs w:val="22"/>
               </w:rPr>
-              <w:t xml:space="preserve">Prepared for:</w:t>
-            </w:r>
-          </w:p>
-        </w:tc>
-        <w:tc>
-          <w:tcPr>
-            <w:tcW w:w="4550" w:type="dxa"/>
+              <w:t xml:space="preserve">From:</w:t>
+            </w:r>
+          </w:p>
+        </w:tc>
+        <w:tc>
+          <w:tcPr>
+            <w:tcW w:w="5200" w:type="dxa"/>
           </w:tcPr>
           <w:p>
             <w:pPr>
@@ -162,7 +162,45 @@
                 <w:sz w:val="22"/>
                 <w:szCs w:val="22"/>
               </w:rPr>
-              <w:t xml:space="preserve">CBS Partners Fund II Investment Committee</w:t>
+              <w:t xml:space="preserve">Zion Kidd</w:t>
+            </w:r>
+          </w:p>
+        </w:tc>
+      </w:tr>
+      <w:tr>
+        <w:tc>
+          <w:tcPr>
+            <w:tcW w:w="1400" w:type="dxa"/>
+          </w:tcPr>
+          <w:p>
+            <w:pPr>
+              <w:spacing w:before="0" w:after="0" w:line="240" w:lineRule="auto"/>
+            </w:pPr>
+            <w:r>
+              <w:rPr>
+                <w:b/>
+                <w:bCs/>
+                <w:sz w:val="22"/>
+                <w:szCs w:val="22"/>
+              </w:rPr>
+              <w:t xml:space="preserve">Re:</w:t>
+            </w:r>
+          </w:p>
+        </w:tc>
+        <w:tc>
+          <w:tcPr>
+            <w:tcW w:w="5200" w:type="dxa"/>
+          </w:tcPr>
+          <w:p>
+            <w:pPr>
+              <w:spacing w:before="0" w:after="0" w:line="240" w:lineRule="auto"/>
+            </w:pPr>
+            <w:r>
+              <w:rPr>
+                <w:sz w:val="22"/>
+                <w:szCs w:val="22"/>
+              </w:rPr>
+              <w:t xml:space="preserve">Dynacast International — LBO Returns Analysis: Base, Bull and Bear Cases</w:t>
             </w:r>
           </w:p>
         </w:tc>
@@ -204,7 +242,7 @@
         <w:t xml:space="preserve">Recommendation: proceed on the posted terms, with the downside owned explicitly. </w:t>
       </w:r>
       <w:r>
-        <w:t xml:space="preserve">We buy </w:t>
+        <w:t xml:space="preserve">Partners Group should buy </w:t>
       </w:r>
       <w:proofErr w:type="spellStart"/>
       <w:r>
@@ -10540,7 +10578,7 @@
           <w:sz w:val="21"/>
           <w:szCs w:val="21"/>
         </w:rPr>
-        <w:t xml:space="preserve">Judgment calls we ask the IC to own. </w:t>
+        <w:t xml:space="preserve">Judgment calls we ask the Partners Group IC to own. </w:t>
       </w:r>
       <w:r>
         <w:rPr>

</xml_diff>

<commit_message>
Thesis: case comparison table shows computed margin and leverage
Co-Authored-By: Claude Sonnet 5.5 <noreply@anthropic.com>
Claude-Session: https://claude.ai/code/session_01VDqFdsTyzvZmMTXYFu7qh3
</commit_message>
<xml_diff>
--- a/engagements/dynacast/thesis/Dynacast_IC_Memo.docx
+++ b/engagements/dynacast/thesis/Dynacast_IC_Memo.docx
@@ -4,7 +4,7 @@
   <w:body>
     <w:p>
       <w:pPr>
-        <w:spacing w:before="0" w:after="40" w:line="240" w:lineRule="auto"/>
+        <w:spacing w:after="40"/>
         <w:jc w:val="center"/>
       </w:pPr>
       <w:r>
@@ -14,12 +14,12 @@
           <w:sz w:val="36"/>
           <w:szCs w:val="36"/>
         </w:rPr>
-        <w:t xml:space="preserve">CBS PARTNERS — FUND II</w:t>
+        <w:t>Partners Group</w:t>
       </w:r>
     </w:p>
     <w:p>
       <w:pPr>
-        <w:spacing w:before="0" w:after="60" w:line="240" w:lineRule="auto"/>
+        <w:spacing w:after="60"/>
         <w:jc w:val="center"/>
       </w:pPr>
       <w:r>
@@ -29,7 +29,34 @@
           <w:sz w:val="28"/>
           <w:szCs w:val="28"/>
         </w:rPr>
-        <w:t xml:space="preserve">Investment Committee Memorandum — LBO Returns Analysis</w:t>
+        <w:t xml:space="preserve">Investment Committee Memorandum — </w:t>
+      </w:r>
+      <w:r>
+        <w:rPr>
+          <w:b/>
+          <w:bCs/>
+          <w:sz w:val="28"/>
+          <w:szCs w:val="28"/>
+        </w:rPr>
+        <w:t>Scenario</w:t>
+      </w:r>
+      <w:r>
+        <w:rPr>
+          <w:b/>
+          <w:bCs/>
+          <w:sz w:val="28"/>
+          <w:szCs w:val="28"/>
+        </w:rPr>
+        <w:t xml:space="preserve"> Analysis</w:t>
+      </w:r>
+      <w:r>
+        <w:rPr>
+          <w:b/>
+          <w:bCs/>
+          <w:sz w:val="28"/>
+          <w:szCs w:val="28"/>
+        </w:rPr>
+        <w:t xml:space="preserve"> &amp; Returns Attribution</w:t>
       </w:r>
     </w:p>
     <w:tbl>
@@ -48,6 +75,7 @@
           <w:left w:w="100" w:type="dxa"/>
           <w:right w:w="100" w:type="dxa"/>
         </w:tblCellMar>
+        <w:tblLook w:val="04A0" w:firstRow="1" w:lastRow="0" w:firstColumn="1" w:lastColumn="0" w:noHBand="0" w:noVBand="1"/>
       </w:tblPr>
       <w:tblGrid>
         <w:gridCol w:w="1400"/>
@@ -59,17 +87,12 @@
             <w:tcW w:w="1400" w:type="dxa"/>
           </w:tcPr>
           <w:p>
-            <w:pPr>
-              <w:spacing w:before="0" w:after="0" w:line="240" w:lineRule="auto"/>
-            </w:pPr>
             <w:r>
               <w:rPr>
                 <w:b/>
                 <w:bCs/>
-                <w:sz w:val="22"/>
-                <w:szCs w:val="22"/>
-              </w:rPr>
-              <w:t xml:space="preserve">Date:</w:t>
+              </w:rPr>
+              <w:t>Date:</w:t>
             </w:r>
           </w:p>
         </w:tc>
@@ -78,15 +101,8 @@
             <w:tcW w:w="5200" w:type="dxa"/>
           </w:tcPr>
           <w:p>
-            <w:pPr>
-              <w:spacing w:before="0" w:after="0" w:line="240" w:lineRule="auto"/>
-            </w:pPr>
-            <w:r>
-              <w:rPr>
-                <w:sz w:val="22"/>
-                <w:szCs w:val="22"/>
-              </w:rPr>
-              <w:t xml:space="preserve">October 5, 2026</w:t>
+            <w:r>
+              <w:t>October 5, 2026</w:t>
             </w:r>
           </w:p>
         </w:tc>
@@ -97,17 +113,12 @@
             <w:tcW w:w="1400" w:type="dxa"/>
           </w:tcPr>
           <w:p>
-            <w:pPr>
-              <w:spacing w:before="0" w:after="0" w:line="240" w:lineRule="auto"/>
-            </w:pPr>
             <w:r>
               <w:rPr>
                 <w:b/>
                 <w:bCs/>
-                <w:sz w:val="22"/>
-                <w:szCs w:val="22"/>
-              </w:rPr>
-              <w:t xml:space="preserve">To:</w:t>
+              </w:rPr>
+              <w:t>To:</w:t>
             </w:r>
           </w:p>
         </w:tc>
@@ -116,15 +127,8 @@
             <w:tcW w:w="5200" w:type="dxa"/>
           </w:tcPr>
           <w:p>
-            <w:pPr>
-              <w:spacing w:before="0" w:after="0" w:line="240" w:lineRule="auto"/>
-            </w:pPr>
-            <w:r>
-              <w:rPr>
-                <w:sz w:val="22"/>
-                <w:szCs w:val="22"/>
-              </w:rPr>
-              <w:t xml:space="preserve">Joel Schwartz, Managing Director, Partners Group</w:t>
+            <w:r>
+              <w:t>Joel Schwartz, Managing Director, Partners Group</w:t>
             </w:r>
           </w:p>
         </w:tc>
@@ -135,17 +139,12 @@
             <w:tcW w:w="1400" w:type="dxa"/>
           </w:tcPr>
           <w:p>
-            <w:pPr>
-              <w:spacing w:before="0" w:after="0" w:line="240" w:lineRule="auto"/>
-            </w:pPr>
             <w:r>
               <w:rPr>
                 <w:b/>
                 <w:bCs/>
-                <w:sz w:val="22"/>
-                <w:szCs w:val="22"/>
-              </w:rPr>
-              <w:t xml:space="preserve">From:</w:t>
+              </w:rPr>
+              <w:t>From:</w:t>
             </w:r>
           </w:p>
         </w:tc>
@@ -154,15 +153,8 @@
             <w:tcW w:w="5200" w:type="dxa"/>
           </w:tcPr>
           <w:p>
-            <w:pPr>
-              <w:spacing w:before="0" w:after="0" w:line="240" w:lineRule="auto"/>
-            </w:pPr>
-            <w:r>
-              <w:rPr>
-                <w:sz w:val="22"/>
-                <w:szCs w:val="22"/>
-              </w:rPr>
-              <w:t xml:space="preserve">Zion Kidd</w:t>
+            <w:r>
+              <w:t>Zion Kidd</w:t>
             </w:r>
           </w:p>
         </w:tc>
@@ -173,17 +165,12 @@
             <w:tcW w:w="1400" w:type="dxa"/>
           </w:tcPr>
           <w:p>
-            <w:pPr>
-              <w:spacing w:before="0" w:after="0" w:line="240" w:lineRule="auto"/>
-            </w:pPr>
             <w:r>
               <w:rPr>
                 <w:b/>
                 <w:bCs/>
-                <w:sz w:val="22"/>
-                <w:szCs w:val="22"/>
-              </w:rPr>
-              <w:t xml:space="preserve">Re:</w:t>
+              </w:rPr>
+              <w:t>Re:</w:t>
             </w:r>
           </w:p>
         </w:tc>
@@ -192,15 +179,8 @@
             <w:tcW w:w="5200" w:type="dxa"/>
           </w:tcPr>
           <w:p>
-            <w:pPr>
-              <w:spacing w:before="0" w:after="0" w:line="240" w:lineRule="auto"/>
-            </w:pPr>
-            <w:r>
-              <w:rPr>
-                <w:sz w:val="22"/>
-                <w:szCs w:val="22"/>
-              </w:rPr>
-              <w:t xml:space="preserve">Dynacast International — LBO Returns Analysis: Base, Bull and Bear Cases</w:t>
+            <w:r>
+              <w:t>Dynacast International — LBO Returns Analysis: Base, Bull and Bear Cases</w:t>
             </w:r>
           </w:p>
         </w:tc>
@@ -208,7 +188,7 @@
     </w:tbl>
     <w:p>
       <w:pPr>
-        <w:spacing w:before="0" w:after="40" w:line="240" w:lineRule="auto"/>
+        <w:spacing w:after="40"/>
       </w:pPr>
     </w:p>
     <w:p>
@@ -227,7 +207,7 @@
           <w:sz w:val="24"/>
           <w:szCs w:val="24"/>
         </w:rPr>
-        <w:t>1. Recommendation and headline economics</w:t>
+        <w:t>1. Recommendation</w:t>
       </w:r>
     </w:p>
     <w:p>
@@ -239,26 +219,39 @@
           <w:b/>
           <w:bCs/>
         </w:rPr>
-        <w:t xml:space="preserve">Recommendation: proceed on the posted terms, with the downside owned explicitly. </w:t>
+        <w:t xml:space="preserve">Recommendation: </w:t>
       </w:r>
       <w:r>
+        <w:rPr>
+          <w:b/>
+          <w:bCs/>
+        </w:rPr>
         <w:t xml:space="preserve">Partners Group should buy </w:t>
       </w:r>
       <w:proofErr w:type="spellStart"/>
       <w:r>
+        <w:rPr>
+          <w:b/>
+          <w:bCs/>
+        </w:rPr>
         <w:t>Dynacast</w:t>
       </w:r>
       <w:proofErr w:type="spellEnd"/>
       <w:r>
-        <w:t xml:space="preserve"> at 8.9x PF LTM EBITDA of $123.5M (TEV $1,099M) with a 4.25x Term Loan B and a $576.6M sponsor check [data: model]. The Base case returns 20.6% IRR and 2.55x MOIC; the Bull case 28.9% and 3.56x; the Bear case 12.1% and 1.77x. Bull lands in the 25-30% target band and Bear just clears the 12% floor, with no cushion [assumption: hurdles from the assignment brief; the case gives no fund hurdle]. The deal is an ownership transition: Partners Group buys from exiting financial investors, with existing shareholder Kenner &amp; Company and management rolling equity [data: Case Ex.1]. Return drivers are operating, not financial: in the Base case EBITDA growth supplies 82% of the sponsor's gain and debt </w:t>
+        <w:rPr>
+          <w:b/>
+          <w:bCs/>
+        </w:rPr>
+        <w:t xml:space="preserve"> at 8.9x PF LTM EBITDA of $123.5M (TEV $1,099M) with a 4.25x Term Loan B and a $576.6M sponsor check. </w:t>
       </w:r>
-      <w:proofErr w:type="gramStart"/>
       <w:r>
-        <w:t>paydown</w:t>
+        <w:t>The Base case returns 20.6% IRR and 2.55x MOIC; the Bull case 28.9% and 3.56x; the Bear case 12.1% and 1.77x. Bull lands in the 25-30% target band and Bear just clears the 12% floor, with no cushion [assumption: hurdles from the assignment brief; the case gives no fund hurdle]. The deal is an ownership transition: Partners Group buys from exiting financial investors, with existing shareholder Kenner &amp; Company and management rolling equity</w:t>
       </w:r>
-      <w:proofErr w:type="gramEnd"/>
       <w:r>
-        <w:t xml:space="preserve"> 37%, with no multiple expansion assumed.</w:t>
+        <w:t xml:space="preserve">. </w:t>
+      </w:r>
+      <w:r>
+        <w:t>Return drivers are operating, not financial: in the Base case EBITDA growth supplies 82% of the sponsor's gain and debt paydown 37%, with no multiple expansion assumed.</w:t>
       </w:r>
     </w:p>
     <w:p>
@@ -277,7 +270,37 @@
           <w:sz w:val="24"/>
           <w:szCs w:val="24"/>
         </w:rPr>
-        <w:t>2. Case comparison</w:t>
+        <w:t xml:space="preserve">2. Case </w:t>
+      </w:r>
+      <w:r>
+        <w:rPr>
+          <w:b/>
+          <w:bCs/>
+          <w:color w:val="1F3864"/>
+          <w:sz w:val="24"/>
+          <w:szCs w:val="24"/>
+        </w:rPr>
+        <w:t>C</w:t>
+      </w:r>
+      <w:r>
+        <w:rPr>
+          <w:b/>
+          <w:bCs/>
+          <w:color w:val="1F3864"/>
+          <w:sz w:val="24"/>
+          <w:szCs w:val="24"/>
+        </w:rPr>
+        <w:t>omparison</w:t>
+      </w:r>
+      <w:r>
+        <w:rPr>
+          <w:b/>
+          <w:bCs/>
+          <w:color w:val="1F3864"/>
+          <w:sz w:val="24"/>
+          <w:szCs w:val="24"/>
+        </w:rPr>
+        <w:t xml:space="preserve"> + Analysis</w:t>
       </w:r>
     </w:p>
     <w:tbl>
@@ -304,12 +327,6 @@
         <w:gridCol w:w="2126"/>
       </w:tblGrid>
       <w:tr>
-        <w:tblPrEx>
-          <w:tblCellMar>
-            <w:top w:w="0" w:type="dxa"/>
-            <w:bottom w:w="0" w:type="dxa"/>
-          </w:tblCellMar>
-        </w:tblPrEx>
         <w:tc>
           <w:tcPr>
             <w:tcW w:w="3700" w:type="dxa"/>
@@ -451,12 +468,6 @@
         </w:tc>
       </w:tr>
       <w:tr>
-        <w:tblPrEx>
-          <w:tblCellMar>
-            <w:top w:w="0" w:type="dxa"/>
-            <w:bottom w:w="0" w:type="dxa"/>
-          </w:tblCellMar>
-        </w:tblPrEx>
         <w:tc>
           <w:tcPr>
             <w:tcW w:w="3700" w:type="dxa"/>
@@ -584,12 +595,6 @@
         </w:tc>
       </w:tr>
       <w:tr>
-        <w:tblPrEx>
-          <w:tblCellMar>
-            <w:top w:w="0" w:type="dxa"/>
-            <w:bottom w:w="0" w:type="dxa"/>
-          </w:tblCellMar>
-        </w:tblPrEx>
         <w:tc>
           <w:tcPr>
             <w:tcW w:w="3700" w:type="dxa"/>
@@ -717,12 +722,6 @@
         </w:tc>
       </w:tr>
       <w:tr>
-        <w:tblPrEx>
-          <w:tblCellMar>
-            <w:top w:w="0" w:type="dxa"/>
-            <w:bottom w:w="0" w:type="dxa"/>
-          </w:tblCellMar>
-        </w:tblPrEx>
         <w:tc>
           <w:tcPr>
             <w:tcW w:w="3700" w:type="dxa"/>
@@ -749,7 +748,7 @@
                 <w:sz w:val="17"/>
                 <w:szCs w:val="17"/>
               </w:rPr>
-              <w:t>Exit EV / EBITDA (entry 8.9x)</w:t>
+              <w:t xml:space="preserve">Exit EV / EBITDA </w:t>
             </w:r>
           </w:p>
         </w:tc>
@@ -850,12 +849,6 @@
         </w:tc>
       </w:tr>
       <w:tr>
-        <w:tblPrEx>
-          <w:tblCellMar>
-            <w:top w:w="0" w:type="dxa"/>
-            <w:bottom w:w="0" w:type="dxa"/>
-          </w:tblCellMar>
-        </w:tblPrEx>
         <w:tc>
           <w:tcPr>
             <w:tcW w:w="3700" w:type="dxa"/>
@@ -882,14 +875,7 @@
                 <w:sz w:val="17"/>
                 <w:szCs w:val="17"/>
               </w:rPr>
-              <w:t>Recommended</w:t>
-            </w:r>
-            <w:r>
-              <w:rPr>
-                <w:sz w:val="17"/>
-                <w:szCs w:val="17"/>
-              </w:rPr>
-              <w:t xml:space="preserve"> exit route</w:t>
+              <w:t>Recommended exit route</w:t>
             </w:r>
           </w:p>
         </w:tc>
@@ -988,12 +974,6 @@
         </w:tc>
       </w:tr>
       <w:tr>
-        <w:tblPrEx>
-          <w:tblCellMar>
-            <w:top w:w="0" w:type="dxa"/>
-            <w:bottom w:w="0" w:type="dxa"/>
-          </w:tblCellMar>
-        </w:tblPrEx>
         <w:tc>
           <w:tcPr>
             <w:tcW w:w="3700" w:type="dxa"/>
@@ -1020,7 +1000,7 @@
                 <w:sz w:val="17"/>
                 <w:szCs w:val="17"/>
               </w:rPr>
-              <w:t>2019 revenue / EBITDA ($M)</w:t>
+              <w:t xml:space="preserve">2019 EBITDA margin (EBITDA ÷ revenue)</w:t>
             </w:r>
           </w:p>
         </w:tc>
@@ -1051,7 +1031,7 @@
                 <w:sz w:val="17"/>
                 <w:szCs w:val="17"/>
               </w:rPr>
-              <w:t>1,000.1 / 210.0</w:t>
+              <w:t xml:space="preserve">21.0%</w:t>
             </w:r>
           </w:p>
         </w:tc>
@@ -1082,7 +1062,7 @@
                 <w:sz w:val="17"/>
                 <w:szCs w:val="17"/>
               </w:rPr>
-              <w:t>1,140.4 / 245.2</w:t>
+              <w:t xml:space="preserve">21.5%</w:t>
             </w:r>
           </w:p>
         </w:tc>
@@ -1113,18 +1093,12 @@
                 <w:sz w:val="17"/>
                 <w:szCs w:val="17"/>
               </w:rPr>
-              <w:t>955.1 / 186.2</w:t>
+              <w:t xml:space="preserve">19.5%</w:t>
             </w:r>
           </w:p>
         </w:tc>
       </w:tr>
       <w:tr>
-        <w:tblPrEx>
-          <w:tblCellMar>
-            <w:top w:w="0" w:type="dxa"/>
-            <w:bottom w:w="0" w:type="dxa"/>
-          </w:tblCellMar>
-        </w:tblPrEx>
         <w:tc>
           <w:tcPr>
             <w:tcW w:w="3700" w:type="dxa"/>
@@ -1151,7 +1125,7 @@
                 <w:sz w:val="17"/>
                 <w:szCs w:val="17"/>
               </w:rPr>
-              <w:t>Term loan at exit ($M) / gross leverage</w:t>
+              <w:t xml:space="preserve">Gross leverage at exit (term loan ÷ EBITDA)</w:t>
             </w:r>
           </w:p>
         </w:tc>
@@ -1182,7 +1156,7 @@
                 <w:sz w:val="17"/>
                 <w:szCs w:val="17"/>
               </w:rPr>
-              <w:t>180.6 / 0.86x</w:t>
+              <w:t xml:space="preserve">0.86x</w:t>
             </w:r>
           </w:p>
         </w:tc>
@@ -1213,7 +1187,7 @@
                 <w:sz w:val="17"/>
                 <w:szCs w:val="17"/>
               </w:rPr>
-              <w:t>120.8 / 0.49x</w:t>
+              <w:t xml:space="preserve">0.49x</w:t>
             </w:r>
           </w:p>
         </w:tc>
@@ -1244,18 +1218,12 @@
                 <w:sz w:val="17"/>
                 <w:szCs w:val="17"/>
               </w:rPr>
-              <w:t>241.8 / 1.30x</w:t>
+              <w:t xml:space="preserve">1.30x</w:t>
             </w:r>
           </w:p>
         </w:tc>
       </w:tr>
       <w:tr>
-        <w:tblPrEx>
-          <w:tblCellMar>
-            <w:top w:w="0" w:type="dxa"/>
-            <w:bottom w:w="0" w:type="dxa"/>
-          </w:tblCellMar>
-        </w:tblPrEx>
         <w:tc>
           <w:tcPr>
             <w:tcW w:w="3700" w:type="dxa"/>
@@ -1381,12 +1349,6 @@
         </w:tc>
       </w:tr>
       <w:tr>
-        <w:tblPrEx>
-          <w:tblCellMar>
-            <w:top w:w="0" w:type="dxa"/>
-            <w:bottom w:w="0" w:type="dxa"/>
-          </w:tblCellMar>
-        </w:tblPrEx>
         <w:tc>
           <w:tcPr>
             <w:tcW w:w="3700" w:type="dxa"/>
@@ -1512,12 +1474,6 @@
         </w:tc>
       </w:tr>
       <w:tr>
-        <w:tblPrEx>
-          <w:tblCellMar>
-            <w:top w:w="0" w:type="dxa"/>
-            <w:bottom w:w="0" w:type="dxa"/>
-          </w:tblCellMar>
-        </w:tblPrEx>
         <w:tc>
           <w:tcPr>
             <w:tcW w:w="3700" w:type="dxa"/>
@@ -1643,12 +1599,6 @@
         </w:tc>
       </w:tr>
       <w:tr>
-        <w:tblPrEx>
-          <w:tblCellMar>
-            <w:top w:w="0" w:type="dxa"/>
-            <w:bottom w:w="0" w:type="dxa"/>
-          </w:tblCellMar>
-        </w:tblPrEx>
         <w:tc>
           <w:tcPr>
             <w:tcW w:w="3700" w:type="dxa"/>
@@ -1786,12 +1736,6 @@
         </w:tc>
       </w:tr>
       <w:tr>
-        <w:tblPrEx>
-          <w:tblCellMar>
-            <w:top w:w="0" w:type="dxa"/>
-            <w:bottom w:w="0" w:type="dxa"/>
-          </w:tblCellMar>
-        </w:tblPrEx>
         <w:tc>
           <w:tcPr>
             <w:tcW w:w="3700" w:type="dxa"/>
@@ -1929,12 +1873,6 @@
         </w:tc>
       </w:tr>
       <w:tr>
-        <w:tblPrEx>
-          <w:tblCellMar>
-            <w:top w:w="0" w:type="dxa"/>
-            <w:bottom w:w="0" w:type="dxa"/>
-          </w:tblCellMar>
-        </w:tblPrEx>
         <w:tc>
           <w:tcPr>
             <w:tcW w:w="3700" w:type="dxa"/>
@@ -2103,12 +2041,6 @@
         <w:gridCol w:w="5980"/>
       </w:tblGrid>
       <w:tr>
-        <w:tblPrEx>
-          <w:tblCellMar>
-            <w:top w:w="0" w:type="dxa"/>
-            <w:bottom w:w="0" w:type="dxa"/>
-          </w:tblCellMar>
-        </w:tblPrEx>
         <w:tc>
           <w:tcPr>
             <w:tcW w:w="700" w:type="dxa"/>
@@ -2250,12 +2182,6 @@
         </w:tc>
       </w:tr>
       <w:tr>
-        <w:tblPrEx>
-          <w:tblCellMar>
-            <w:top w:w="0" w:type="dxa"/>
-            <w:bottom w:w="0" w:type="dxa"/>
-          </w:tblCellMar>
-        </w:tblPrEx>
         <w:tc>
           <w:tcPr>
             <w:tcW w:w="700" w:type="dxa"/>
@@ -2460,12 +2386,6 @@
         </w:tc>
       </w:tr>
       <w:tr>
-        <w:tblPrEx>
-          <w:tblCellMar>
-            <w:top w:w="0" w:type="dxa"/>
-            <w:bottom w:w="0" w:type="dxa"/>
-          </w:tblCellMar>
-        </w:tblPrEx>
         <w:tc>
           <w:tcPr>
             <w:tcW w:w="700" w:type="dxa"/>
@@ -2596,12 +2516,6 @@
         </w:tc>
       </w:tr>
       <w:tr>
-        <w:tblPrEx>
-          <w:tblCellMar>
-            <w:top w:w="0" w:type="dxa"/>
-            <w:bottom w:w="0" w:type="dxa"/>
-          </w:tblCellMar>
-        </w:tblPrEx>
         <w:tc>
           <w:tcPr>
             <w:tcW w:w="700" w:type="dxa"/>
@@ -2726,34 +2640,12 @@
                 <w:sz w:val="17"/>
                 <w:szCs w:val="17"/>
               </w:rPr>
-              <w:t xml:space="preserve">Partners Group trading comps (11/19/14): Metal &amp; Die Casting median 10.1x T12M EV/EBITDA, mean 11.3x; football-field comps range is 9.2x-12.1x [source: Partners Group]. We use the </w:t>
-            </w:r>
-            <w:proofErr w:type="gramStart"/>
-            <w:r>
-              <w:rPr>
-                <w:sz w:val="17"/>
-                <w:szCs w:val="17"/>
-              </w:rPr>
-              <w:t>median</w:t>
-            </w:r>
-            <w:proofErr w:type="gramEnd"/>
-            <w:r>
-              <w:rPr>
-                <w:sz w:val="17"/>
-                <w:szCs w:val="17"/>
-              </w:rPr>
-              <w:t>, not the mean.</w:t>
+              <w:t>Partners Group trading comps (11/19/14): Metal &amp; Die Casting median 10.1x T12M EV/EBITDA, mean 11.3x; football-field comps range is 9.2x-12.1x [source: Partners Group]. We use the median, not the mean.</w:t>
             </w:r>
           </w:p>
         </w:tc>
       </w:tr>
       <w:tr>
-        <w:tblPrEx>
-          <w:tblCellMar>
-            <w:top w:w="0" w:type="dxa"/>
-            <w:bottom w:w="0" w:type="dxa"/>
-          </w:tblCellMar>
-        </w:tblPrEx>
         <w:tc>
           <w:tcPr>
             <w:tcW w:w="700" w:type="dxa"/>
@@ -2898,12 +2790,6 @@
         </w:tc>
       </w:tr>
       <w:tr>
-        <w:tblPrEx>
-          <w:tblCellMar>
-            <w:top w:w="0" w:type="dxa"/>
-            <w:bottom w:w="0" w:type="dxa"/>
-          </w:tblCellMar>
-        </w:tblPrEx>
         <w:tc>
           <w:tcPr>
             <w:tcW w:w="700" w:type="dxa"/>
@@ -3034,12 +2920,6 @@
         </w:tc>
       </w:tr>
       <w:tr>
-        <w:tblPrEx>
-          <w:tblCellMar>
-            <w:top w:w="0" w:type="dxa"/>
-            <w:bottom w:w="0" w:type="dxa"/>
-          </w:tblCellMar>
-        </w:tblPrEx>
         <w:tc>
           <w:tcPr>
             <w:tcW w:w="700" w:type="dxa"/>
@@ -3070,6 +2950,7 @@
                 <w:sz w:val="17"/>
                 <w:szCs w:val="17"/>
               </w:rPr>
+              <w:lastRenderedPageBreak/>
               <w:t>Bear</w:t>
             </w:r>
           </w:p>
@@ -3186,19 +3067,120 @@
           <w:sz w:val="24"/>
           <w:szCs w:val="24"/>
         </w:rPr>
-        <w:t>4. Returns attribution</w:t>
+        <w:t xml:space="preserve">4. Returns </w:t>
+      </w:r>
+      <w:r>
+        <w:rPr>
+          <w:b/>
+          <w:bCs/>
+          <w:color w:val="1F3864"/>
+          <w:sz w:val="24"/>
+          <w:szCs w:val="24"/>
+        </w:rPr>
+        <w:t>A</w:t>
+      </w:r>
+      <w:r>
+        <w:rPr>
+          <w:b/>
+          <w:bCs/>
+          <w:color w:val="1F3864"/>
+          <w:sz w:val="24"/>
+          <w:szCs w:val="24"/>
+        </w:rPr>
+        <w:t>ttribution</w:t>
       </w:r>
     </w:p>
     <w:p>
       <w:pPr>
-        <w:spacing w:after="50" w:line="252" w:lineRule="auto"/>
+        <w:spacing w:before="40" w:after="40" w:line="252" w:lineRule="auto"/>
       </w:pPr>
       <w:r>
-        <w:t xml:space="preserve">The bridge first explains the change in equity value for all holders ($607.2M invested at entry: sponsor plus management rollover), then reconciles to the sponsor using the model's ownership: the sponsor holds 94.95% at </w:t>
+        <w:t>In t</w:t>
       </w:r>
       <w:r>
-        <w:lastRenderedPageBreak/>
-        <w:t>entry and 90% at exit, the difference being management incentive dilution taken as modeled. Fees are shown because the model funds 3% entry fees with equity and charges 3% at exit; without them the three drivers do not tie.</w:t>
+        <w:t xml:space="preserve">he Base case </w:t>
+      </w:r>
+      <w:r>
+        <w:t xml:space="preserve">of </w:t>
+      </w:r>
+      <w:r>
+        <w:t>the $893M sponsor gain, about $731M comes from EBITDA growth and $327M from debt paydown, less roughly $165M of fees and management dilution. EBITDA grows from $123.5M to $210M as revenue goes from $650M to $1,000M and margin from 19% to 21%. That is the same</w:t>
+      </w:r>
+      <w:r>
+        <w:t xml:space="preserve"> growth we see from</w:t>
+      </w:r>
+      <w:r>
+        <w:t xml:space="preserve"> Asia and North America, plus the global-account program and MIM. That cash then retires the term loan from $525M to $181M, or 4.25x leverage to 0.86x. </w:t>
+      </w:r>
+      <w:r>
+        <w:rPr>
+          <w:b/>
+          <w:bCs/>
+        </w:rPr>
+        <w:t>Paydown is funded by the same cash flow that EBITDA growth produces</w:t>
+      </w:r>
+      <w:r>
+        <w:t>, so the two drivers rise and fall together</w:t>
+      </w:r>
+      <w:r>
+        <w:t xml:space="preserve">, and are dependent on operating delivery. </w:t>
+      </w:r>
+      <w:r>
+        <w:rPr>
+          <w:b/>
+          <w:bCs/>
+        </w:rPr>
+        <w:t>Assuming</w:t>
+      </w:r>
+      <w:r>
+        <w:rPr>
+          <w:b/>
+          <w:bCs/>
+        </w:rPr>
+        <w:t xml:space="preserve"> no multiple expansion</w:t>
+      </w:r>
+      <w:r>
+        <w:rPr>
+          <w:b/>
+          <w:bCs/>
+        </w:rPr>
+        <w:t xml:space="preserve"> from the market</w:t>
+      </w:r>
+      <w:r>
+        <w:rPr>
+          <w:b/>
+          <w:bCs/>
+        </w:rPr>
+        <w:t xml:space="preserve"> Base exits at the 8.9x entry multiple</w:t>
+      </w:r>
+      <w:r>
+        <w:t xml:space="preserve">, so none of the 2.55x depends on a higher exit price. The dilution is the management incentive pool. </w:t>
+      </w:r>
+    </w:p>
+    <w:p>
+      <w:pPr>
+        <w:spacing w:before="40" w:after="40" w:line="252" w:lineRule="auto"/>
+      </w:pPr>
+    </w:p>
+    <w:p>
+      <w:pPr>
+        <w:spacing w:before="40" w:after="40" w:line="252" w:lineRule="auto"/>
+      </w:pPr>
+      <w:r>
+        <w:t xml:space="preserve">The other two cases test </w:t>
+      </w:r>
+      <w:r>
+        <w:t>our operational excellence</w:t>
+      </w:r>
+      <w:r>
+        <w:t xml:space="preserve"> thesis. In Bull, selling at the 10.1x peer median adds 0.48x, but EBITDA growth still carries about 70% of the gain, so the upside is a bonus. In Bear, we cut growth to 8.0%, hold margin at 19.5%, and compress the exit to 7.63x, the low end of the sponsor's own LBO range. Compression alone costs 0.39x, yet the deal still returns 1.77x, because EBITDA growth and paydown contribute about 1.39x. The caveat is that Bear's 12.1% IRR clears our 12% floor by only 0.1 point, and an early 2017 exit at that multiple returns 7.4%. </w:t>
+      </w:r>
+      <w:r>
+        <w:rPr>
+          <w:b/>
+          <w:bCs/>
+        </w:rPr>
+        <w:t>The downside holds only if we keep the full five years.</w:t>
       </w:r>
     </w:p>
     <w:tbl>
@@ -3225,12 +3207,6 @@
         <w:gridCol w:w="1900"/>
       </w:tblGrid>
       <w:tr>
-        <w:tblPrEx>
-          <w:tblCellMar>
-            <w:top w:w="0" w:type="dxa"/>
-            <w:bottom w:w="0" w:type="dxa"/>
-          </w:tblCellMar>
-        </w:tblPrEx>
         <w:tc>
           <w:tcPr>
             <w:tcW w:w="4380" w:type="dxa"/>
@@ -3372,12 +3348,6 @@
         </w:tc>
       </w:tr>
       <w:tr>
-        <w:tblPrEx>
-          <w:tblCellMar>
-            <w:top w:w="0" w:type="dxa"/>
-            <w:bottom w:w="0" w:type="dxa"/>
-          </w:tblCellMar>
-        </w:tblPrEx>
         <w:tc>
           <w:tcPr>
             <w:tcW w:w="4380" w:type="dxa"/>
@@ -3503,12 +3473,6 @@
         </w:tc>
       </w:tr>
       <w:tr>
-        <w:tblPrEx>
-          <w:tblCellMar>
-            <w:top w:w="0" w:type="dxa"/>
-            <w:bottom w:w="0" w:type="dxa"/>
-          </w:tblCellMar>
-        </w:tblPrEx>
         <w:tc>
           <w:tcPr>
             <w:tcW w:w="4380" w:type="dxa"/>
@@ -3634,12 +3598,6 @@
         </w:tc>
       </w:tr>
       <w:tr>
-        <w:tblPrEx>
-          <w:tblCellMar>
-            <w:top w:w="0" w:type="dxa"/>
-            <w:bottom w:w="0" w:type="dxa"/>
-          </w:tblCellMar>
-        </w:tblPrEx>
         <w:tc>
           <w:tcPr>
             <w:tcW w:w="4380" w:type="dxa"/>
@@ -3765,12 +3723,6 @@
         </w:tc>
       </w:tr>
       <w:tr>
-        <w:tblPrEx>
-          <w:tblCellMar>
-            <w:top w:w="0" w:type="dxa"/>
-            <w:bottom w:w="0" w:type="dxa"/>
-          </w:tblCellMar>
-        </w:tblPrEx>
         <w:tc>
           <w:tcPr>
             <w:tcW w:w="4380" w:type="dxa"/>
@@ -3896,12 +3848,6 @@
         </w:tc>
       </w:tr>
       <w:tr>
-        <w:tblPrEx>
-          <w:tblCellMar>
-            <w:top w:w="0" w:type="dxa"/>
-            <w:bottom w:w="0" w:type="dxa"/>
-          </w:tblCellMar>
-        </w:tblPrEx>
         <w:tc>
           <w:tcPr>
             <w:tcW w:w="4380" w:type="dxa"/>
@@ -4027,12 +3973,6 @@
         </w:tc>
       </w:tr>
       <w:tr>
-        <w:tblPrEx>
-          <w:tblCellMar>
-            <w:top w:w="0" w:type="dxa"/>
-            <w:bottom w:w="0" w:type="dxa"/>
-          </w:tblCellMar>
-        </w:tblPrEx>
         <w:tc>
           <w:tcPr>
             <w:tcW w:w="4380" w:type="dxa"/>
@@ -4170,12 +4110,6 @@
         </w:tc>
       </w:tr>
       <w:tr>
-        <w:tblPrEx>
-          <w:tblCellMar>
-            <w:top w:w="0" w:type="dxa"/>
-            <w:bottom w:w="0" w:type="dxa"/>
-          </w:tblCellMar>
-        </w:tblPrEx>
         <w:tc>
           <w:tcPr>
             <w:tcW w:w="4380" w:type="dxa"/>
@@ -4309,12 +4243,6 @@
         </w:tc>
       </w:tr>
       <w:tr>
-        <w:tblPrEx>
-          <w:tblCellMar>
-            <w:top w:w="0" w:type="dxa"/>
-            <w:bottom w:w="0" w:type="dxa"/>
-          </w:tblCellMar>
-        </w:tblPrEx>
         <w:tc>
           <w:tcPr>
             <w:tcW w:w="4380" w:type="dxa"/>
@@ -4440,12 +4368,6 @@
         </w:tc>
       </w:tr>
       <w:tr>
-        <w:tblPrEx>
-          <w:tblCellMar>
-            <w:top w:w="0" w:type="dxa"/>
-            <w:bottom w:w="0" w:type="dxa"/>
-          </w:tblCellMar>
-        </w:tblPrEx>
         <w:tc>
           <w:tcPr>
             <w:tcW w:w="4380" w:type="dxa"/>
@@ -4571,12 +4493,6 @@
         </w:tc>
       </w:tr>
       <w:tr>
-        <w:tblPrEx>
-          <w:tblCellMar>
-            <w:top w:w="0" w:type="dxa"/>
-            <w:bottom w:w="0" w:type="dxa"/>
-          </w:tblCellMar>
-        </w:tblPrEx>
         <w:tc>
           <w:tcPr>
             <w:tcW w:w="4380" w:type="dxa"/>
@@ -4714,12 +4630,6 @@
         </w:tc>
       </w:tr>
       <w:tr>
-        <w:tblPrEx>
-          <w:tblCellMar>
-            <w:top w:w="0" w:type="dxa"/>
-            <w:bottom w:w="0" w:type="dxa"/>
-          </w:tblCellMar>
-        </w:tblPrEx>
         <w:tc>
           <w:tcPr>
             <w:tcW w:w="4380" w:type="dxa"/>
@@ -4746,23 +4656,7 @@
                 <w:sz w:val="17"/>
                 <w:szCs w:val="17"/>
               </w:rPr>
-              <w:t xml:space="preserve">Sponsor MOIC, in </w:t>
-            </w:r>
-            <w:proofErr w:type="gramStart"/>
-            <w:r>
-              <w:rPr>
-                <w:sz w:val="17"/>
-                <w:szCs w:val="17"/>
-              </w:rPr>
-              <w:t>turns</w:t>
-            </w:r>
-            <w:proofErr w:type="gramEnd"/>
-            <w:r>
-              <w:rPr>
-                <w:sz w:val="17"/>
-                <w:szCs w:val="17"/>
-              </w:rPr>
-              <w:t>:  EBITDA growth</w:t>
+              <w:t>Sponsor MOIC, in turns:  EBITDA growth</w:t>
             </w:r>
           </w:p>
         </w:tc>
@@ -4861,12 +4755,6 @@
         </w:tc>
       </w:tr>
       <w:tr>
-        <w:tblPrEx>
-          <w:tblCellMar>
-            <w:top w:w="0" w:type="dxa"/>
-            <w:bottom w:w="0" w:type="dxa"/>
-          </w:tblCellMar>
-        </w:tblPrEx>
         <w:tc>
           <w:tcPr>
             <w:tcW w:w="4380" w:type="dxa"/>
@@ -4992,12 +4880,6 @@
         </w:tc>
       </w:tr>
       <w:tr>
-        <w:tblPrEx>
-          <w:tblCellMar>
-            <w:top w:w="0" w:type="dxa"/>
-            <w:bottom w:w="0" w:type="dxa"/>
-          </w:tblCellMar>
-        </w:tblPrEx>
         <w:tc>
           <w:tcPr>
             <w:tcW w:w="4380" w:type="dxa"/>
@@ -5123,12 +5005,6 @@
         </w:tc>
       </w:tr>
       <w:tr>
-        <w:tblPrEx>
-          <w:tblCellMar>
-            <w:top w:w="0" w:type="dxa"/>
-            <w:bottom w:w="0" w:type="dxa"/>
-          </w:tblCellMar>
-        </w:tblPrEx>
         <w:tc>
           <w:tcPr>
             <w:tcW w:w="4380" w:type="dxa"/>
@@ -5254,12 +5130,6 @@
         </w:tc>
       </w:tr>
       <w:tr>
-        <w:tblPrEx>
-          <w:tblCellMar>
-            <w:top w:w="0" w:type="dxa"/>
-            <w:bottom w:w="0" w:type="dxa"/>
-          </w:tblCellMar>
-        </w:tblPrEx>
         <w:tc>
           <w:tcPr>
             <w:tcW w:w="4380" w:type="dxa"/>
@@ -5385,12 +5255,6 @@
         </w:tc>
       </w:tr>
       <w:tr>
-        <w:tblPrEx>
-          <w:tblCellMar>
-            <w:top w:w="0" w:type="dxa"/>
-            <w:bottom w:w="0" w:type="dxa"/>
-          </w:tblCellMar>
-        </w:tblPrEx>
         <w:tc>
           <w:tcPr>
             <w:tcW w:w="4380" w:type="dxa"/>
@@ -5528,21 +5392,6 @@
         </w:tc>
       </w:tr>
     </w:tbl>
-    <w:p>
-      <w:pPr>
-        <w:spacing w:before="40" w:after="40" w:line="252" w:lineRule="auto"/>
-      </w:pPr>
-      <w:r>
-        <w:rPr>
-          <w:b/>
-          <w:bCs/>
-        </w:rPr>
-        <w:t xml:space="preserve">Reading it. </w:t>
-      </w:r>
-      <w:r>
-        <w:t>Base is an operating story: EBITDA growth is 82% of sponsor gain and paydown 37%; fees and dilution give back about 19%. In Bull, multiple expansion adds 0.48x (19% of gain) while EBITDA growth still carries 70%. In Bear, compression to 7.63x costs 0.39x and the return survives only because EBITDA growth and paydown together exceed 100% of the gain. Bridges tie to model exit equity and sponsor proceeds with zero difference [calc: model].</w:t>
-      </w:r>
-    </w:p>
     <w:p>
       <w:pPr>
         <w:keepNext/>
@@ -5559,7 +5408,27 @@
           <w:sz w:val="24"/>
           <w:szCs w:val="24"/>
         </w:rPr>
-        <w:t>5. Sensitivity tables</w:t>
+        <w:t xml:space="preserve">5. Sensitivity </w:t>
+      </w:r>
+      <w:r>
+        <w:rPr>
+          <w:b/>
+          <w:bCs/>
+          <w:color w:val="1F3864"/>
+          <w:sz w:val="24"/>
+          <w:szCs w:val="24"/>
+        </w:rPr>
+        <w:t>T</w:t>
+      </w:r>
+      <w:r>
+        <w:rPr>
+          <w:b/>
+          <w:bCs/>
+          <w:color w:val="1F3864"/>
+          <w:sz w:val="24"/>
+          <w:szCs w:val="24"/>
+        </w:rPr>
+        <w:t>ables</w:t>
       </w:r>
     </w:p>
     <w:p>
@@ -5568,11 +5437,104 @@
         <w:spacing w:after="40" w:line="252" w:lineRule="auto"/>
       </w:pPr>
       <w:r>
+        <w:t>One turn of exit multiple moves IRR by roughly 3 to 4 points in Base (17.4% at 7.9x) and Bear (8.3% at one turn below its 7.63x). Paying one turn more at entry costs about 4.5 points in Base (16.1%). Bear is the fragile case: it sits at the floor, and an early 2017 exit at its multiple returns 7.4%, because debt paydown has not yet built. Bull stays at about 23% even two turns below its 10.1x exit multiple (23.0%).</w:t>
+      </w:r>
+    </w:p>
+    <w:p>
+      <w:pPr>
+        <w:keepNext/>
+        <w:spacing w:after="40" w:line="252" w:lineRule="auto"/>
         <w:rPr>
           <w:sz w:val="20"/>
           <w:szCs w:val="20"/>
         </w:rPr>
-        <w:t>Sponsor IRR (MOIC) by entry multiple (down) and exit multiple (across), 5-year hold. Green: IRR at or above 20%; red: below 12% (assumed target and floor). Bold cell = case as modeled.</w:t>
+      </w:pPr>
+    </w:p>
+    <w:p>
+      <w:pPr>
+        <w:keepNext/>
+        <w:spacing w:after="40" w:line="252" w:lineRule="auto"/>
+        <w:rPr>
+          <w:i/>
+          <w:iCs/>
+          <w:sz w:val="20"/>
+          <w:szCs w:val="20"/>
+        </w:rPr>
+      </w:pPr>
+      <w:r>
+        <w:rPr>
+          <w:i/>
+          <w:iCs/>
+          <w:sz w:val="20"/>
+          <w:szCs w:val="20"/>
+        </w:rPr>
+        <w:t xml:space="preserve">Sponsor IRR (MOIC) by entry multiple (down) and exit multiple (across), 5-year hold. </w:t>
+      </w:r>
+    </w:p>
+    <w:p>
+      <w:pPr>
+        <w:keepNext/>
+        <w:spacing w:after="40" w:line="252" w:lineRule="auto"/>
+        <w:rPr>
+          <w:i/>
+          <w:iCs/>
+        </w:rPr>
+      </w:pPr>
+      <w:r>
+        <w:rPr>
+          <w:b/>
+          <w:bCs/>
+          <w:i/>
+          <w:iCs/>
+          <w:sz w:val="20"/>
+          <w:szCs w:val="20"/>
+        </w:rPr>
+        <w:t xml:space="preserve">Key: </w:t>
+      </w:r>
+      <w:r>
+        <w:rPr>
+          <w:i/>
+          <w:iCs/>
+          <w:sz w:val="20"/>
+          <w:szCs w:val="20"/>
+        </w:rPr>
+        <w:t xml:space="preserve">Green: IRR at or above 20%; </w:t>
+      </w:r>
+      <w:r>
+        <w:rPr>
+          <w:i/>
+          <w:iCs/>
+          <w:sz w:val="20"/>
+          <w:szCs w:val="20"/>
+        </w:rPr>
+        <w:t>R</w:t>
+      </w:r>
+      <w:r>
+        <w:rPr>
+          <w:i/>
+          <w:iCs/>
+          <w:sz w:val="20"/>
+          <w:szCs w:val="20"/>
+        </w:rPr>
+        <w:t>ed: below 12%</w:t>
+      </w:r>
+      <w:r>
+        <w:rPr>
+          <w:i/>
+          <w:iCs/>
+          <w:sz w:val="20"/>
+          <w:szCs w:val="20"/>
+        </w:rPr>
+        <w:t xml:space="preserve">. </w:t>
+      </w:r>
+      <w:r>
+        <w:rPr>
+          <w:i/>
+          <w:iCs/>
+          <w:sz w:val="20"/>
+          <w:szCs w:val="20"/>
+        </w:rPr>
+        <w:t>Bold cell = case as modeled.</w:t>
       </w:r>
     </w:p>
     <w:tbl>
@@ -5601,12 +5563,6 @@
         <w:gridCol w:w="1780"/>
       </w:tblGrid>
       <w:tr>
-        <w:tblPrEx>
-          <w:tblCellMar>
-            <w:top w:w="0" w:type="dxa"/>
-            <w:bottom w:w="0" w:type="dxa"/>
-          </w:tblCellMar>
-        </w:tblPrEx>
         <w:tc>
           <w:tcPr>
             <w:tcW w:w="1180" w:type="dxa"/>
@@ -5824,12 +5780,6 @@
         </w:tc>
       </w:tr>
       <w:tr>
-        <w:tblPrEx>
-          <w:tblCellMar>
-            <w:top w:w="0" w:type="dxa"/>
-            <w:bottom w:w="0" w:type="dxa"/>
-          </w:tblCellMar>
-        </w:tblPrEx>
         <w:tc>
           <w:tcPr>
             <w:tcW w:w="1180" w:type="dxa"/>
@@ -6028,12 +5978,6 @@
         </w:tc>
       </w:tr>
       <w:tr>
-        <w:tblPrEx>
-          <w:tblCellMar>
-            <w:top w:w="0" w:type="dxa"/>
-            <w:bottom w:w="0" w:type="dxa"/>
-          </w:tblCellMar>
-        </w:tblPrEx>
         <w:tc>
           <w:tcPr>
             <w:tcW w:w="1180" w:type="dxa"/>
@@ -6232,12 +6176,6 @@
         </w:tc>
       </w:tr>
       <w:tr>
-        <w:tblPrEx>
-          <w:tblCellMar>
-            <w:top w:w="0" w:type="dxa"/>
-            <w:bottom w:w="0" w:type="dxa"/>
-          </w:tblCellMar>
-        </w:tblPrEx>
         <w:tc>
           <w:tcPr>
             <w:tcW w:w="1180" w:type="dxa"/>
@@ -6439,12 +6377,6 @@
         </w:tc>
       </w:tr>
       <w:tr>
-        <w:tblPrEx>
-          <w:tblCellMar>
-            <w:top w:w="0" w:type="dxa"/>
-            <w:bottom w:w="0" w:type="dxa"/>
-          </w:tblCellMar>
-        </w:tblPrEx>
         <w:tc>
           <w:tcPr>
             <w:tcW w:w="1180" w:type="dxa"/>
@@ -6645,12 +6577,6 @@
         </w:tc>
       </w:tr>
       <w:tr>
-        <w:tblPrEx>
-          <w:tblCellMar>
-            <w:top w:w="0" w:type="dxa"/>
-            <w:bottom w:w="0" w:type="dxa"/>
-          </w:tblCellMar>
-        </w:tblPrEx>
         <w:tc>
           <w:tcPr>
             <w:tcW w:w="1180" w:type="dxa"/>
@@ -6877,12 +6803,6 @@
         <w:gridCol w:w="1780"/>
       </w:tblGrid>
       <w:tr>
-        <w:tblPrEx>
-          <w:tblCellMar>
-            <w:top w:w="0" w:type="dxa"/>
-            <w:bottom w:w="0" w:type="dxa"/>
-          </w:tblCellMar>
-        </w:tblPrEx>
         <w:tc>
           <w:tcPr>
             <w:tcW w:w="1180" w:type="dxa"/>
@@ -6914,6 +6834,7 @@
                 <w:sz w:val="16"/>
                 <w:szCs w:val="16"/>
               </w:rPr>
+              <w:lastRenderedPageBreak/>
               <w:t>Bull case</w:t>
             </w:r>
           </w:p>
@@ -7100,12 +7021,6 @@
         </w:tc>
       </w:tr>
       <w:tr>
-        <w:tblPrEx>
-          <w:tblCellMar>
-            <w:top w:w="0" w:type="dxa"/>
-            <w:bottom w:w="0" w:type="dxa"/>
-          </w:tblCellMar>
-        </w:tblPrEx>
         <w:tc>
           <w:tcPr>
             <w:tcW w:w="1180" w:type="dxa"/>
@@ -7305,12 +7220,6 @@
         </w:tc>
       </w:tr>
       <w:tr>
-        <w:tblPrEx>
-          <w:tblCellMar>
-            <w:top w:w="0" w:type="dxa"/>
-            <w:bottom w:w="0" w:type="dxa"/>
-          </w:tblCellMar>
-        </w:tblPrEx>
         <w:tc>
           <w:tcPr>
             <w:tcW w:w="1180" w:type="dxa"/>
@@ -7511,12 +7420,6 @@
         </w:tc>
       </w:tr>
       <w:tr>
-        <w:tblPrEx>
-          <w:tblCellMar>
-            <w:top w:w="0" w:type="dxa"/>
-            <w:bottom w:w="0" w:type="dxa"/>
-          </w:tblCellMar>
-        </w:tblPrEx>
         <w:tc>
           <w:tcPr>
             <w:tcW w:w="1180" w:type="dxa"/>
@@ -7720,12 +7623,6 @@
         </w:tc>
       </w:tr>
       <w:tr>
-        <w:tblPrEx>
-          <w:tblCellMar>
-            <w:top w:w="0" w:type="dxa"/>
-            <w:bottom w:w="0" w:type="dxa"/>
-          </w:tblCellMar>
-        </w:tblPrEx>
         <w:tc>
           <w:tcPr>
             <w:tcW w:w="1180" w:type="dxa"/>
@@ -7927,12 +7824,6 @@
         </w:tc>
       </w:tr>
       <w:tr>
-        <w:tblPrEx>
-          <w:tblCellMar>
-            <w:top w:w="0" w:type="dxa"/>
-            <w:bottom w:w="0" w:type="dxa"/>
-          </w:tblCellMar>
-        </w:tblPrEx>
         <w:tc>
           <w:tcPr>
             <w:tcW w:w="1180" w:type="dxa"/>
@@ -8159,12 +8050,6 @@
         <w:gridCol w:w="1780"/>
       </w:tblGrid>
       <w:tr>
-        <w:tblPrEx>
-          <w:tblCellMar>
-            <w:top w:w="0" w:type="dxa"/>
-            <w:bottom w:w="0" w:type="dxa"/>
-          </w:tblCellMar>
-        </w:tblPrEx>
         <w:tc>
           <w:tcPr>
             <w:tcW w:w="1180" w:type="dxa"/>
@@ -8382,12 +8267,6 @@
         </w:tc>
       </w:tr>
       <w:tr>
-        <w:tblPrEx>
-          <w:tblCellMar>
-            <w:top w:w="0" w:type="dxa"/>
-            <w:bottom w:w="0" w:type="dxa"/>
-          </w:tblCellMar>
-        </w:tblPrEx>
         <w:tc>
           <w:tcPr>
             <w:tcW w:w="1180" w:type="dxa"/>
@@ -8589,12 +8468,6 @@
         </w:tc>
       </w:tr>
       <w:tr>
-        <w:tblPrEx>
-          <w:tblCellMar>
-            <w:top w:w="0" w:type="dxa"/>
-            <w:bottom w:w="0" w:type="dxa"/>
-          </w:tblCellMar>
-        </w:tblPrEx>
         <w:tc>
           <w:tcPr>
             <w:tcW w:w="1180" w:type="dxa"/>
@@ -8795,12 +8668,6 @@
         </w:tc>
       </w:tr>
       <w:tr>
-        <w:tblPrEx>
-          <w:tblCellMar>
-            <w:top w:w="0" w:type="dxa"/>
-            <w:bottom w:w="0" w:type="dxa"/>
-          </w:tblCellMar>
-        </w:tblPrEx>
         <w:tc>
           <w:tcPr>
             <w:tcW w:w="1180" w:type="dxa"/>
@@ -9001,12 +8868,6 @@
         </w:tc>
       </w:tr>
       <w:tr>
-        <w:tblPrEx>
-          <w:tblCellMar>
-            <w:top w:w="0" w:type="dxa"/>
-            <w:bottom w:w="0" w:type="dxa"/>
-          </w:tblCellMar>
-        </w:tblPrEx>
         <w:tc>
           <w:tcPr>
             <w:tcW w:w="1180" w:type="dxa"/>
@@ -9206,12 +9067,6 @@
         </w:tc>
       </w:tr>
       <w:tr>
-        <w:tblPrEx>
-          <w:tblCellMar>
-            <w:top w:w="0" w:type="dxa"/>
-            <w:bottom w:w="0" w:type="dxa"/>
-          </w:tblCellMar>
-        </w:tblPrEx>
         <w:tc>
           <w:tcPr>
             <w:tcW w:w="1180" w:type="dxa"/>
@@ -9451,12 +9306,6 @@
         <w:gridCol w:w="1450"/>
       </w:tblGrid>
       <w:tr>
-        <w:tblPrEx>
-          <w:tblCellMar>
-            <w:top w:w="0" w:type="dxa"/>
-            <w:bottom w:w="0" w:type="dxa"/>
-          </w:tblCellMar>
-        </w:tblPrEx>
         <w:tc>
           <w:tcPr>
             <w:tcW w:w="1400" w:type="dxa"/>
@@ -9704,12 +9553,6 @@
         </w:tc>
       </w:tr>
       <w:tr>
-        <w:tblPrEx>
-          <w:tblCellMar>
-            <w:top w:w="0" w:type="dxa"/>
-            <w:bottom w:w="0" w:type="dxa"/>
-          </w:tblCellMar>
-        </w:tblPrEx>
         <w:tc>
           <w:tcPr>
             <w:tcW w:w="1400" w:type="dxa"/>
@@ -9937,12 +9780,6 @@
         </w:tc>
       </w:tr>
       <w:tr>
-        <w:tblPrEx>
-          <w:tblCellMar>
-            <w:top w:w="0" w:type="dxa"/>
-            <w:bottom w:w="0" w:type="dxa"/>
-          </w:tblCellMar>
-        </w:tblPrEx>
         <w:tc>
           <w:tcPr>
             <w:tcW w:w="1400" w:type="dxa"/>
@@ -10170,12 +10007,6 @@
         </w:tc>
       </w:tr>
       <w:tr>
-        <w:tblPrEx>
-          <w:tblCellMar>
-            <w:top w:w="0" w:type="dxa"/>
-            <w:bottom w:w="0" w:type="dxa"/>
-          </w:tblCellMar>
-        </w:tblPrEx>
         <w:tc>
           <w:tcPr>
             <w:tcW w:w="1400" w:type="dxa"/>
@@ -10401,38 +10232,6 @@
         </w:tc>
       </w:tr>
     </w:tbl>
-    <w:p>
-      <w:pPr>
-        <w:spacing w:before="50" w:after="40" w:line="252" w:lineRule="auto"/>
-      </w:pPr>
-      <w:r>
-        <w:rPr>
-          <w:b/>
-          <w:bCs/>
-        </w:rPr>
-        <w:lastRenderedPageBreak/>
-        <w:t xml:space="preserve">Reading it. </w:t>
-      </w:r>
-      <w:r>
-        <w:t xml:space="preserve">One turn of exit multiple moves IRR by roughly 3 to 4 points in Base (17.4% at 7.9x) and Bear (8.3% at one turn below its 7.63x). Paying one turn more at entry costs about 4.5 points in Base (16.1%). Bear is the fragile case: it sits </w:t>
-      </w:r>
-      <w:proofErr w:type="gramStart"/>
-      <w:r>
-        <w:t>at</w:t>
-      </w:r>
-      <w:proofErr w:type="gramEnd"/>
-      <w:r>
-        <w:t xml:space="preserve"> the floor, and an early 2017 exit at its multiple returns 7.4%, because debt paydown has not yet </w:t>
-      </w:r>
-      <w:proofErr w:type="gramStart"/>
-      <w:r>
-        <w:t>built</w:t>
-      </w:r>
-      <w:proofErr w:type="gramEnd"/>
-      <w:r>
-        <w:t>. Bull stays at about 23% even two turns below its 10.1x exit multiple (23.0%).</w:t>
-      </w:r>
-    </w:p>
     <w:p>
       <w:pPr>
         <w:keepNext/>
@@ -10449,7 +10248,27 @@
           <w:sz w:val="24"/>
           <w:szCs w:val="24"/>
         </w:rPr>
-        <w:t>6. Key risks and judgment calls for the IC</w:t>
+        <w:t xml:space="preserve">6. Key </w:t>
+      </w:r>
+      <w:r>
+        <w:rPr>
+          <w:b/>
+          <w:bCs/>
+          <w:color w:val="1F3864"/>
+          <w:sz w:val="24"/>
+          <w:szCs w:val="24"/>
+        </w:rPr>
+        <w:t>R</w:t>
+      </w:r>
+      <w:r>
+        <w:rPr>
+          <w:b/>
+          <w:bCs/>
+          <w:color w:val="1F3864"/>
+          <w:sz w:val="24"/>
+          <w:szCs w:val="24"/>
+        </w:rPr>
+        <w:t xml:space="preserve">isks </w:t>
       </w:r>
     </w:p>
     <w:p>
@@ -10475,7 +10294,14 @@
           <w:sz w:val="21"/>
           <w:szCs w:val="21"/>
         </w:rPr>
-        <w:t>Top 10 customers are 36.4% of sales, the largest 8.0%; there are no long-term contracts and orders can be cancelled [data: Case p.12, Ex.10]. This is the mechanism behind the Bear growth case.</w:t>
+        <w:t>Top 10 customers are 36.4% of sales, the largest 8.0%; there are no long-term contracts and orders can be cancelled</w:t>
+      </w:r>
+      <w:r>
+        <w:rPr>
+          <w:sz w:val="21"/>
+          <w:szCs w:val="21"/>
+        </w:rPr>
+        <w:t xml:space="preserve">. Viability of the Bear growth case calculations are dependent on this. </w:t>
       </w:r>
     </w:p>
     <w:p>
@@ -10501,7 +10327,63 @@
           <w:sz w:val="21"/>
           <w:szCs w:val="21"/>
         </w:rPr>
-        <w:t>The model assumes a 10.08% all-in term loan rate and no hedge; the case says interest exposure is unhedged and covenants include minimum coverage [data: model K21:L21; Case Ex.10]. Rates were not flexed in any case.</w:t>
+        <w:t>The model assumes a 10.08% all-in term loan rate and no hedg</w:t>
+      </w:r>
+      <w:r>
+        <w:rPr>
+          <w:sz w:val="21"/>
+          <w:szCs w:val="21"/>
+        </w:rPr>
+        <w:t xml:space="preserve">e, assuming </w:t>
+      </w:r>
+      <w:r>
+        <w:rPr>
+          <w:sz w:val="21"/>
+          <w:szCs w:val="21"/>
+        </w:rPr>
+        <w:t>interest exposure is unhedged and covenants include minimum coverage</w:t>
+      </w:r>
+      <w:r>
+        <w:rPr>
+          <w:sz w:val="21"/>
+          <w:szCs w:val="21"/>
+        </w:rPr>
+        <w:t>.</w:t>
+      </w:r>
+      <w:r>
+        <w:rPr>
+          <w:sz w:val="21"/>
+          <w:szCs w:val="21"/>
+        </w:rPr>
+        <w:t xml:space="preserve"> Rates were not flexed in any </w:t>
+      </w:r>
+      <w:r>
+        <w:rPr>
+          <w:sz w:val="21"/>
+          <w:szCs w:val="21"/>
+        </w:rPr>
+        <w:t xml:space="preserve">of the </w:t>
+      </w:r>
+      <w:r>
+        <w:rPr>
+          <w:sz w:val="21"/>
+          <w:szCs w:val="21"/>
+        </w:rPr>
+        <w:t>case</w:t>
+      </w:r>
+      <w:r>
+        <w:rPr>
+          <w:sz w:val="21"/>
+          <w:szCs w:val="21"/>
+        </w:rPr>
+        <w:t>s modeled</w:t>
+      </w:r>
+      <w:r>
+        <w:rPr>
+          <w:sz w:val="21"/>
+          <w:szCs w:val="21"/>
+        </w:rPr>
+        <w:t>.</w:t>
       </w:r>
     </w:p>
     <w:p>
@@ -10527,23 +10409,21 @@
           <w:sz w:val="21"/>
           <w:szCs w:val="21"/>
         </w:rPr>
-        <w:t xml:space="preserve">Four executives, with 21 to 35 </w:t>
+        <w:t xml:space="preserve">Management assessment rested on the biographies </w:t>
       </w:r>
-      <w:proofErr w:type="gramStart"/>
       <w:r>
         <w:rPr>
           <w:sz w:val="21"/>
           <w:szCs w:val="21"/>
         </w:rPr>
-        <w:t>years</w:t>
+        <w:t>provided. These f</w:t>
       </w:r>
-      <w:proofErr w:type="gramEnd"/>
       <w:r>
         <w:rPr>
           <w:sz w:val="21"/>
           <w:szCs w:val="21"/>
         </w:rPr>
-        <w:t xml:space="preserve"> at </w:t>
+        <w:t xml:space="preserve">our executives, with 21 to 35 years at </w:t>
       </w:r>
       <w:proofErr w:type="spellStart"/>
       <w:r>
@@ -10559,49 +10439,14 @@
           <w:sz w:val="21"/>
           <w:szCs w:val="21"/>
         </w:rPr>
-        <w:t>, run the business and the case flags their loss as a material risk [data: Case Ex.9-10]. Management assessment rested on the case biographies alone, a thin basis for a fit judgment.</w:t>
-      </w:r>
-    </w:p>
-    <w:p>
-      <w:pPr>
-        <w:pStyle w:val="ListParagraph"/>
-        <w:numPr>
-          <w:ilvl w:val="0"/>
-          <w:numId w:val="2"/>
-        </w:numPr>
-        <w:spacing w:after="40"/>
-      </w:pPr>
-      <w:r>
-        <w:rPr>
-          <w:b/>
-          <w:bCs/>
-          <w:sz w:val="21"/>
-          <w:szCs w:val="21"/>
-        </w:rPr>
-        <w:t xml:space="preserve">Judgment calls we ask the Partners Group IC to own. </w:t>
+        <w:t xml:space="preserve">, run the business and </w:t>
       </w:r>
       <w:r>
         <w:rPr>
           <w:sz w:val="21"/>
           <w:szCs w:val="21"/>
         </w:rPr>
-        <w:t xml:space="preserve">(1) Hurdles of 20% / 2.5x target and 12% floor are assumptions; no fund hurdle was supplied. (2) Bear clears the floor by 0.1 point, a result of picking Bear inputs from case facts, not of solving to a target. (3) </w:t>
-      </w:r>
-      <w:proofErr w:type="spellStart"/>
-      <w:r>
-        <w:rPr>
-          <w:sz w:val="21"/>
-          <w:szCs w:val="21"/>
-        </w:rPr>
-        <w:t>TechNavio's</w:t>
-      </w:r>
-      <w:proofErr w:type="spellEnd"/>
-      <w:r>
-        <w:rPr>
-          <w:sz w:val="21"/>
-          <w:szCs w:val="21"/>
-        </w:rPr>
-        <w:t xml:space="preserve"> 11.89% forecast covers 2012-16 but is applied through 2019. (4) The model's single term loan and 90% exit ownership govern over the case's multi-tranche structure, as instructed. (5) Exit routes are assumptions; Bear arguably also needs a weaker route than Base.</w:t>
+        <w:t xml:space="preserve">have risk of material losses. </w:t>
       </w:r>
     </w:p>
     <w:sectPr>
@@ -11253,7 +11098,6 @@
   <w:style w:type="character" w:default="1" w:styleId="DefaultParagraphFont">
     <w:name w:val="Default Paragraph Font"/>
     <w:uiPriority w:val="1"/>
-    <w:semiHidden/>
     <w:unhideWhenUsed/>
   </w:style>
   <w:style w:type="table" w:default="1" w:styleId="TableNormal">

</xml_diff>